<commit_message>
update to trial times
</commit_message>
<xml_diff>
--- a/output/tables/table_summary.docx
+++ b/output/tables/table_summary.docx
@@ -286,7 +286,7 @@
                 <w:rFonts w:ascii="Calibri" w:hAnsi="Calibri"/>
                 <w:sz w:val="20"/>
               </w:rPr>
-              <w:t xml:space="default">&lt;strong&gt;140&lt;/strong&gt; (8 - 11)</w:t>
+              <w:t xml:space="default">&lt;strong&gt;137&lt;/strong&gt; (8 - 9)</w:t>
             </w:r>
           </w:p>
         </w:tc>
@@ -387,7 +387,7 @@
                 <w:rFonts w:ascii="Calibri" w:hAnsi="Calibri"/>
                 <w:sz w:val="20"/>
               </w:rPr>
-              <w:t xml:space="default">&lt;strong&gt;105&lt;/strong&gt; (5 - 9)</w:t>
+              <w:t xml:space="default">&lt;strong&gt;102&lt;/strong&gt; (5 - 7)</w:t>
             </w:r>
           </w:p>
         </w:tc>
@@ -488,7 +488,7 @@
                 <w:rFonts w:ascii="Calibri" w:hAnsi="Calibri"/>
                 <w:sz w:val="20"/>
               </w:rPr>
-              <w:t xml:space="default">&lt;strong&gt;14.0%&lt;/strong&gt; (9.0% - 17.0%)</w:t>
+              <w:t xml:space="default">&lt;strong&gt;14.0%&lt;/strong&gt; (12.0% - 17.0%)</w:t>
             </w:r>
           </w:p>
         </w:tc>
@@ -742,7 +742,7 @@
                 <w:rFonts w:ascii="Calibri" w:hAnsi="Calibri"/>
                 <w:sz w:val="20"/>
               </w:rPr>
-              <w:t xml:space="default">&lt;strong&gt;7,110&lt;/strong&gt; ±8,535 (0 - 53,961)</w:t>
+              <w:t xml:space="default">&lt;strong&gt;7,202&lt;/strong&gt; ±8,589 (6 - 53,961)</w:t>
             </w:r>
           </w:p>
         </w:tc>
@@ -852,7 +852,7 @@
                 <w:rFonts w:ascii="Calibri" w:hAnsi="Calibri"/>
                 <w:sz w:val="20"/>
               </w:rPr>
-              <w:t xml:space="default">&lt;strong&gt;2h 9m&lt;/strong&gt; ±1h 51m (0s - 7h 39m)</w:t>
+              <w:t xml:space="default">&lt;strong&gt;2h 11m&lt;/strong&gt; ±1h 51m (0s - 7h 39m)</w:t>
             </w:r>
           </w:p>
         </w:tc>
@@ -962,7 +962,7 @@
                 <w:rFonts w:ascii="Calibri" w:hAnsi="Calibri"/>
                 <w:sz w:val="20"/>
               </w:rPr>
-              <w:t xml:space="default">&lt;strong&gt;2h 52m&lt;/strong&gt; ±1h 47m (0s - 7h 53m)</w:t>
+              <w:t xml:space="default">&lt;strong&gt;2h 56m&lt;/strong&gt; ±1h 46m (19m - 7h 53m)</w:t>
             </w:r>
           </w:p>
         </w:tc>
@@ -1072,7 +1072,7 @@
                 <w:rFonts w:ascii="Calibri" w:hAnsi="Calibri"/>
                 <w:sz w:val="20"/>
               </w:rPr>
-              <w:t xml:space="default">&lt;strong&gt;9h 6m&lt;/strong&gt; ±3h 31m (2h 32m - 1d)</w:t>
+              <w:t xml:space="default">&lt;strong&gt;8h 47m&lt;/strong&gt; ±2h 52m (2h 32m - 21h 50m)</w:t>
             </w:r>
           </w:p>
         </w:tc>
@@ -1182,7 +1182,7 @@
                 <w:rFonts w:ascii="Calibri" w:hAnsi="Calibri"/>
                 <w:sz w:val="20"/>
               </w:rPr>
-              <w:t xml:space="default">&lt;strong&gt;28m 4s&lt;/strong&gt; ±25m 33s (0s - 2h 24m)</w:t>
+              <w:t xml:space="default">&lt;strong&gt;28m 29s&lt;/strong&gt; ±25m 35s (0s - 2h 24m)</w:t>
             </w:r>
           </w:p>
         </w:tc>
@@ -1292,7 +1292,7 @@
                 <w:rFonts w:ascii="Calibri" w:hAnsi="Calibri"/>
                 <w:sz w:val="20"/>
               </w:rPr>
-              <w:t xml:space="default">&lt;strong&gt;41m 14s&lt;/strong&gt; ±47m 56s (0s - 3h 30m)</w:t>
+              <w:t xml:space="default">&lt;strong&gt;41m 5s&lt;/strong&gt; ±47m 17s (0s - 3h 30m)</w:t>
             </w:r>
           </w:p>
         </w:tc>
@@ -1402,7 +1402,7 @@
                 <w:rFonts w:ascii="Calibri" w:hAnsi="Calibri"/>
                 <w:sz w:val="20"/>
               </w:rPr>
-              <w:t xml:space="default">&lt;strong&gt;09:48&lt;/strong&gt; ±03:02 (00:06 - 16:12)</w:t>
+              <w:t xml:space="default">&lt;strong&gt;09:47&lt;/strong&gt; ±03:03 (00:06 - 16:12)</w:t>
             </w:r>
           </w:p>
         </w:tc>
@@ -1640,7 +1640,7 @@
                 <w:rFonts w:ascii="Calibri" w:hAnsi="Calibri"/>
                 <w:sz w:val="20"/>
               </w:rPr>
-              <w:t xml:space="default">&lt;strong&gt;19:33&lt;/strong&gt; ±02:23 (12:30 - 23:58)</w:t>
+              <w:t xml:space="default">&lt;strong&gt;19:34&lt;/strong&gt; ±02:24 (12:30 - 23:58)</w:t>
             </w:r>
           </w:p>
         </w:tc>
@@ -1759,7 +1759,7 @@
                 <w:rFonts w:ascii="Calibri" w:hAnsi="Calibri"/>
                 <w:sz w:val="20"/>
               </w:rPr>
-              <w:t xml:space="default">&lt;strong&gt;14:13&lt;/strong&gt; ±02:07 (04:59 - 18:58)</w:t>
+              <w:t xml:space="default">&lt;strong&gt;14:23&lt;/strong&gt; ±01:43 (10:25 - 18:58)</w:t>
             </w:r>
           </w:p>
         </w:tc>
@@ -1878,7 +1878,7 @@
                 <w:rFonts w:ascii="Calibri" w:hAnsi="Calibri"/>
                 <w:sz w:val="20"/>
               </w:rPr>
-              <w:t xml:space="default">&lt;strong&gt;03:26&lt;/strong&gt; ±02:03 (01:20 - 22:04)</w:t>
+              <w:t xml:space="default">&lt;strong&gt;03:28&lt;/strong&gt; ±02:05 (01:20 - 22:04)</w:t>
             </w:r>
           </w:p>
         </w:tc>
@@ -2013,7 +2013,7 @@
                 <w:rFonts w:ascii="Calibri" w:hAnsi="Calibri"/>
                 <w:sz w:val="20"/>
               </w:rPr>
-              <w:t xml:space="default">&lt;strong&gt;95.7&lt;/strong&gt; ±84.9 (0.0 - 414.7)</w:t>
+              <w:t xml:space="default">&lt;strong&gt;97.4&lt;/strong&gt; ±85.1 (0.2 - 414.7)</w:t>
             </w:r>
           </w:p>
         </w:tc>
@@ -2240,7 +2240,7 @@
                 <w:rFonts w:ascii="Calibri" w:hAnsi="Calibri"/>
                 <w:sz w:val="20"/>
               </w:rPr>
-              <w:t xml:space="default">&lt;strong&gt;0.311&lt;/strong&gt; ±0.103 (0.170 - 0.531)</w:t>
+              <w:t xml:space="default">&lt;strong&gt;0.317&lt;/strong&gt; ±0.103 (0.170 - 0.531)</w:t>
             </w:r>
           </w:p>
         </w:tc>
@@ -2341,7 +2341,7 @@
                 <w:rFonts w:ascii="Calibri" w:hAnsi="Calibri"/>
                 <w:sz w:val="20"/>
               </w:rPr>
-              <w:t xml:space="default">&lt;strong&gt;1.361&lt;/strong&gt; ±0.416 (0.750 - 1.978)</w:t>
+              <w:t xml:space="default">&lt;strong&gt;1.354&lt;/strong&gt; ±0.428 (0.626 - 1.978)</w:t>
             </w:r>
           </w:p>
         </w:tc>
@@ -2388,7 +2388,22 @@
                 <w:rFonts w:ascii="Calibri" w:hAnsi="Calibri"/>
                 <w:sz w:val="20"/>
               </w:rPr>
-              <w:t xml:space="default">values show: **mean** ±sd (min - max) and are all based on measurements of melanopic EDI (lx)</w:t>
+              <w:t xml:space="preserve">values show: </w:t>
+            </w:r>
+            <w:r>
+              <w:rPr>
+                <w:b w:val="true"/>
+                <w:rFonts w:ascii="Calibri" w:hAnsi="Calibri"/>
+                <w:sz w:val="20"/>
+              </w:rPr>
+              <w:t xml:space="preserve">mean</w:t>
+            </w:r>
+            <w:r>
+              <w:rPr>
+                <w:rFonts w:ascii="Calibri" w:hAnsi="Calibri"/>
+                <w:sz w:val="20"/>
+              </w:rPr>
+              <w:t xml:space="preserve"> ±sd (min - max) and are all based on measurements of melanopic EDI (lx)</w:t>
             </w:r>
           </w:p>
         </w:tc>
@@ -2452,7 +2467,7 @@
                 <w:rFonts w:ascii="Calibri" w:hAnsi="Calibri"/>
                 <w:sz w:val="20"/>
               </w:rPr>
-              <w:t xml:space="default">Metrics are calculated on a by-participant-day basis (n=105) with the exception of IV and IS, which are calculated on a by-participant basis (n=17).</w:t>
+              <w:t xml:space="default">Metrics are calculated on a by-participant-day basis (n=102) with the exception of IV and IS, which are calculated on a by-participant basis (n=17).</w:t>
             </w:r>
           </w:p>
         </w:tc>
@@ -2484,7 +2499,7 @@
                 <w:rFonts w:ascii="Calibri" w:hAnsi="Calibri"/>
                 <w:sz w:val="20"/>
               </w:rPr>
-              <w:t xml:space="default">Values were log 10 transformed prior to averaging, with an offset of 0.1, and backtransformed afterwards</w:t>
+              <w:t xml:space="preserve">Values were log 10 transformed prior to averaging, with an offset of 0.1, and backtransformed afterwards</w:t>
             </w:r>
           </w:p>
         </w:tc>
@@ -2616,10 +2631,10 @@
   <w:docDefaults>
     <w:rPrDefault>
       <w:rPr>
-        <w:rFonts w:asciiTheme="minorHAnsi" w:cstheme="minorBidi" w:eastAsiaTheme="minorHAnsi" w:hAnsiTheme="minorHAnsi"/>
+        <w:rFonts w:asciiTheme="minorHAnsi" w:cstheme="minorBidi" w:eastAsiaTheme="minorEastAsia" w:hAnsiTheme="minorHAnsi"/>
         <w:sz w:val="24"/>
         <w:szCs w:val="24"/>
-        <w:lang w:bidi="ar-SA" w:eastAsia="en-US" w:val="en-US"/>
+        <w:lang w:bidi="ar-SA" w:eastAsia="zh-CN" w:val="en-US"/>
       </w:rPr>
     </w:rPrDefault>
     <w:pPrDefault>
@@ -3160,13 +3175,6 @@
       </w:tblCellMar>
     </w:tblPr>
     <w:tblStylePr w:type="firstRow">
-      <w:tblPr>
-        <w:jc w:val="left"/>
-        <w:tblInd w:type="dxa" w:w="0"/>
-      </w:tblPr>
-      <w:trPr>
-        <w:jc w:val="left"/>
-      </w:trPr>
       <w:tcPr>
         <w:tcBorders>
           <w:bottom w:val="single"/>

</xml_diff>